<commit_message>
System guide: describe importing pupils, parents and staff from a spreadsheet
</commit_message>
<xml_diff>
--- a/docs/brochure/ADsmartschool-System-Guide.docx
+++ b/docs/brochure/ADsmartschool-System-Guide.docx
@@ -17,7 +17,7 @@
           <w:noProof/>
         </w:rPr>
         <w:drawing>
-          <wp:inline distT="0" distB="0" distL="0" distR="0" wp14:anchorId="12CA10B2" wp14:editId="6CEF3F59">
+          <wp:inline distT="0" distB="0" distL="0" distR="0" wp14:anchorId="716B7890" wp14:editId="42FD3030">
             <wp:extent cx="1809750" cy="1809750"/>
             <wp:effectExtent l="0" t="0" r="0" b="0"/>
             <wp:docPr id="1" name="logo" descr="ADsmartschool logo" title="ADsmartschool logo"/>
@@ -199,7 +199,7 @@
     <w:sdt>
       <w:sdtPr>
         <w:alias w:val="Contents"/>
-        <w:id w:val="-402074081"/>
+        <w:id w:val="-1633703392"/>
       </w:sdtPr>
       <w:sdtEndPr/>
       <w:sdtContent>
@@ -226,7 +226,7 @@
           <w:r>
             <w:fldChar w:fldCharType="separate"/>
           </w:r>
-          <w:hyperlink w:anchor="_Toc242879988" w:history="1">
+          <w:hyperlink w:anchor="_Toc242884355" w:history="1">
             <w:r>
               <w:rPr>
                 <w:rStyle w:val="Hyperlink"/>
@@ -250,7 +250,7 @@
               <w:rPr>
                 <w:noProof/>
               </w:rPr>
-              <w:instrText xml:space="preserve"> PAGEREF _Toc242879988 \h </w:instrText>
+              <w:instrText xml:space="preserve"> PAGEREF _Toc242884355 \h </w:instrText>
             </w:r>
             <w:r>
               <w:rPr>
@@ -291,7 +291,7 @@
               <w14:ligatures w14:val="standardContextual"/>
             </w:rPr>
           </w:pPr>
-          <w:hyperlink w:anchor="_Toc242879989" w:history="1">
+          <w:hyperlink w:anchor="_Toc242884356" w:history="1">
             <w:r>
               <w:rPr>
                 <w:rStyle w:val="Hyperlink"/>
@@ -315,7 +315,7 @@
               <w:rPr>
                 <w:noProof/>
               </w:rPr>
-              <w:instrText xml:space="preserve"> PAGEREF _Toc242879989 \h </w:instrText>
+              <w:instrText xml:space="preserve"> PAGEREF _Toc242884356 \h </w:instrText>
             </w:r>
             <w:r>
               <w:rPr>
@@ -356,7 +356,7 @@
               <w14:ligatures w14:val="standardContextual"/>
             </w:rPr>
           </w:pPr>
-          <w:hyperlink w:anchor="_Toc242879990" w:history="1">
+          <w:hyperlink w:anchor="_Toc242884357" w:history="1">
             <w:r>
               <w:rPr>
                 <w:rStyle w:val="Hyperlink"/>
@@ -380,7 +380,7 @@
               <w:rPr>
                 <w:noProof/>
               </w:rPr>
-              <w:instrText xml:space="preserve"> PAGEREF _Toc242879990 \h </w:instrText>
+              <w:instrText xml:space="preserve"> PAGEREF _Toc242884357 \h </w:instrText>
             </w:r>
             <w:r>
               <w:rPr>
@@ -421,7 +421,7 @@
               <w14:ligatures w14:val="standardContextual"/>
             </w:rPr>
           </w:pPr>
-          <w:hyperlink w:anchor="_Toc242879991" w:history="1">
+          <w:hyperlink w:anchor="_Toc242884358" w:history="1">
             <w:r>
               <w:rPr>
                 <w:rStyle w:val="Hyperlink"/>
@@ -445,7 +445,7 @@
               <w:rPr>
                 <w:noProof/>
               </w:rPr>
-              <w:instrText xml:space="preserve"> PAGEREF _Toc242879991 \h </w:instrText>
+              <w:instrText xml:space="preserve"> PAGEREF _Toc242884358 \h </w:instrText>
             </w:r>
             <w:r>
               <w:rPr>
@@ -486,7 +486,7 @@
               <w14:ligatures w14:val="standardContextual"/>
             </w:rPr>
           </w:pPr>
-          <w:hyperlink w:anchor="_Toc242879992" w:history="1">
+          <w:hyperlink w:anchor="_Toc242884359" w:history="1">
             <w:r>
               <w:rPr>
                 <w:rStyle w:val="Hyperlink"/>
@@ -510,7 +510,7 @@
               <w:rPr>
                 <w:noProof/>
               </w:rPr>
-              <w:instrText xml:space="preserve"> PAGEREF _Toc242879992 \h </w:instrText>
+              <w:instrText xml:space="preserve"> PAGEREF _Toc242884359 \h </w:instrText>
             </w:r>
             <w:r>
               <w:rPr>
@@ -527,7 +527,7 @@
               <w:rPr>
                 <w:noProof/>
               </w:rPr>
-              <w:t>12</w:t>
+              <w:t>13</w:t>
             </w:r>
             <w:r>
               <w:rPr>
@@ -551,7 +551,7 @@
               <w14:ligatures w14:val="standardContextual"/>
             </w:rPr>
           </w:pPr>
-          <w:hyperlink w:anchor="_Toc242879993" w:history="1">
+          <w:hyperlink w:anchor="_Toc242884360" w:history="1">
             <w:r>
               <w:rPr>
                 <w:rStyle w:val="Hyperlink"/>
@@ -575,7 +575,7 @@
               <w:rPr>
                 <w:noProof/>
               </w:rPr>
-              <w:instrText xml:space="preserve"> PAGEREF _Toc242879993 \h </w:instrText>
+              <w:instrText xml:space="preserve"> PAGEREF _Toc242884360 \h </w:instrText>
             </w:r>
             <w:r>
               <w:rPr>
@@ -592,7 +592,7 @@
               <w:rPr>
                 <w:noProof/>
               </w:rPr>
-              <w:t>13</w:t>
+              <w:t>14</w:t>
             </w:r>
             <w:r>
               <w:rPr>
@@ -616,7 +616,7 @@
               <w14:ligatures w14:val="standardContextual"/>
             </w:rPr>
           </w:pPr>
-          <w:hyperlink w:anchor="_Toc242879994" w:history="1">
+          <w:hyperlink w:anchor="_Toc242884361" w:history="1">
             <w:r>
               <w:rPr>
                 <w:rStyle w:val="Hyperlink"/>
@@ -640,7 +640,7 @@
               <w:rPr>
                 <w:noProof/>
               </w:rPr>
-              <w:instrText xml:space="preserve"> PAGEREF _Toc242879994 \h </w:instrText>
+              <w:instrText xml:space="preserve"> PAGEREF _Toc242884361 \h </w:instrText>
             </w:r>
             <w:r>
               <w:rPr>
@@ -681,7 +681,7 @@
               <w14:ligatures w14:val="standardContextual"/>
             </w:rPr>
           </w:pPr>
-          <w:hyperlink w:anchor="_Toc242879995" w:history="1">
+          <w:hyperlink w:anchor="_Toc242884362" w:history="1">
             <w:r>
               <w:rPr>
                 <w:rStyle w:val="Hyperlink"/>
@@ -705,7 +705,7 @@
               <w:rPr>
                 <w:noProof/>
               </w:rPr>
-              <w:instrText xml:space="preserve"> PAGEREF _Toc242879995 \h </w:instrText>
+              <w:instrText xml:space="preserve"> PAGEREF _Toc242884362 \h </w:instrText>
             </w:r>
             <w:r>
               <w:rPr>
@@ -746,7 +746,7 @@
               <w14:ligatures w14:val="standardContextual"/>
             </w:rPr>
           </w:pPr>
-          <w:hyperlink w:anchor="_Toc242879996" w:history="1">
+          <w:hyperlink w:anchor="_Toc242884363" w:history="1">
             <w:r>
               <w:rPr>
                 <w:rStyle w:val="Hyperlink"/>
@@ -770,7 +770,7 @@
               <w:rPr>
                 <w:noProof/>
               </w:rPr>
-              <w:instrText xml:space="preserve"> PAGEREF _Toc242879996 \h </w:instrText>
+              <w:instrText xml:space="preserve"> PAGEREF _Toc242884363 \h </w:instrText>
             </w:r>
             <w:r>
               <w:rPr>
@@ -811,7 +811,7 @@
               <w14:ligatures w14:val="standardContextual"/>
             </w:rPr>
           </w:pPr>
-          <w:hyperlink w:anchor="_Toc242879997" w:history="1">
+          <w:hyperlink w:anchor="_Toc242884364" w:history="1">
             <w:r>
               <w:rPr>
                 <w:rStyle w:val="Hyperlink"/>
@@ -835,7 +835,7 @@
               <w:rPr>
                 <w:noProof/>
               </w:rPr>
-              <w:instrText xml:space="preserve"> PAGEREF _Toc242879997 \h </w:instrText>
+              <w:instrText xml:space="preserve"> PAGEREF _Toc242884364 \h </w:instrText>
             </w:r>
             <w:r>
               <w:rPr>
@@ -876,7 +876,7 @@
               <w14:ligatures w14:val="standardContextual"/>
             </w:rPr>
           </w:pPr>
-          <w:hyperlink w:anchor="_Toc242879998" w:history="1">
+          <w:hyperlink w:anchor="_Toc242884365" w:history="1">
             <w:r>
               <w:rPr>
                 <w:rStyle w:val="Hyperlink"/>
@@ -900,7 +900,7 @@
               <w:rPr>
                 <w:noProof/>
               </w:rPr>
-              <w:instrText xml:space="preserve"> PAGEREF _Toc242879998 \h </w:instrText>
+              <w:instrText xml:space="preserve"> PAGEREF _Toc242884365 \h </w:instrText>
             </w:r>
             <w:r>
               <w:rPr>
@@ -941,7 +941,7 @@
               <w14:ligatures w14:val="standardContextual"/>
             </w:rPr>
           </w:pPr>
-          <w:hyperlink w:anchor="_Toc242879999" w:history="1">
+          <w:hyperlink w:anchor="_Toc242884366" w:history="1">
             <w:r>
               <w:rPr>
                 <w:rStyle w:val="Hyperlink"/>
@@ -965,7 +965,7 @@
               <w:rPr>
                 <w:noProof/>
               </w:rPr>
-              <w:instrText xml:space="preserve"> PAGEREF _Toc242879999 \h </w:instrText>
+              <w:instrText xml:space="preserve"> PAGEREF _Toc242884366 \h </w:instrText>
             </w:r>
             <w:r>
               <w:rPr>
@@ -1006,7 +1006,7 @@
               <w14:ligatures w14:val="standardContextual"/>
             </w:rPr>
           </w:pPr>
-          <w:hyperlink w:anchor="_Toc242880000" w:history="1">
+          <w:hyperlink w:anchor="_Toc242884367" w:history="1">
             <w:r>
               <w:rPr>
                 <w:rStyle w:val="Hyperlink"/>
@@ -1030,7 +1030,7 @@
               <w:rPr>
                 <w:noProof/>
               </w:rPr>
-              <w:instrText xml:space="preserve"> PAGEREF _Toc242880000 \h </w:instrText>
+              <w:instrText xml:space="preserve"> PAGEREF _Toc242884367 \h </w:instrText>
             </w:r>
             <w:r>
               <w:rPr>
@@ -1071,7 +1071,7 @@
               <w14:ligatures w14:val="standardContextual"/>
             </w:rPr>
           </w:pPr>
-          <w:hyperlink w:anchor="_Toc242880001" w:history="1">
+          <w:hyperlink w:anchor="_Toc242884368" w:history="1">
             <w:r>
               <w:rPr>
                 <w:rStyle w:val="Hyperlink"/>
@@ -1095,7 +1095,7 @@
               <w:rPr>
                 <w:noProof/>
               </w:rPr>
-              <w:instrText xml:space="preserve"> PAGEREF _Toc242880001 \h </w:instrText>
+              <w:instrText xml:space="preserve"> PAGEREF _Toc242884368 \h </w:instrText>
             </w:r>
             <w:r>
               <w:rPr>
@@ -1136,7 +1136,7 @@
               <w14:ligatures w14:val="standardContextual"/>
             </w:rPr>
           </w:pPr>
-          <w:hyperlink w:anchor="_Toc242880002" w:history="1">
+          <w:hyperlink w:anchor="_Toc242884369" w:history="1">
             <w:r>
               <w:rPr>
                 <w:rStyle w:val="Hyperlink"/>
@@ -1160,7 +1160,7 @@
               <w:rPr>
                 <w:noProof/>
               </w:rPr>
-              <w:instrText xml:space="preserve"> PAGEREF _Toc242880002 \h </w:instrText>
+              <w:instrText xml:space="preserve"> PAGEREF _Toc242884369 \h </w:instrText>
             </w:r>
             <w:r>
               <w:rPr>
@@ -1201,7 +1201,7 @@
               <w14:ligatures w14:val="standardContextual"/>
             </w:rPr>
           </w:pPr>
-          <w:hyperlink w:anchor="_Toc242880003" w:history="1">
+          <w:hyperlink w:anchor="_Toc242884370" w:history="1">
             <w:r>
               <w:rPr>
                 <w:rStyle w:val="Hyperlink"/>
@@ -1225,7 +1225,7 @@
               <w:rPr>
                 <w:noProof/>
               </w:rPr>
-              <w:instrText xml:space="preserve"> PAGEREF _Toc242880003 \h </w:instrText>
+              <w:instrText xml:space="preserve"> PAGEREF _Toc242884370 \h </w:instrText>
             </w:r>
             <w:r>
               <w:rPr>
@@ -1266,7 +1266,7 @@
               <w14:ligatures w14:val="standardContextual"/>
             </w:rPr>
           </w:pPr>
-          <w:hyperlink w:anchor="_Toc242880004" w:history="1">
+          <w:hyperlink w:anchor="_Toc242884371" w:history="1">
             <w:r>
               <w:rPr>
                 <w:rStyle w:val="Hyperlink"/>
@@ -1290,7 +1290,7 @@
               <w:rPr>
                 <w:noProof/>
               </w:rPr>
-              <w:instrText xml:space="preserve"> PAGEREF _Toc242880004 \h </w:instrText>
+              <w:instrText xml:space="preserve"> PAGEREF _Toc242884371 \h </w:instrText>
             </w:r>
             <w:r>
               <w:rPr>
@@ -1331,7 +1331,7 @@
               <w14:ligatures w14:val="standardContextual"/>
             </w:rPr>
           </w:pPr>
-          <w:hyperlink w:anchor="_Toc242880005" w:history="1">
+          <w:hyperlink w:anchor="_Toc242884372" w:history="1">
             <w:r>
               <w:rPr>
                 <w:rStyle w:val="Hyperlink"/>
@@ -1355,7 +1355,7 @@
               <w:rPr>
                 <w:noProof/>
               </w:rPr>
-              <w:instrText xml:space="preserve"> PAGEREF _Toc242880005 \h </w:instrText>
+              <w:instrText xml:space="preserve"> PAGEREF _Toc242884372 \h </w:instrText>
             </w:r>
             <w:r>
               <w:rPr>
@@ -1396,7 +1396,7 @@
               <w14:ligatures w14:val="standardContextual"/>
             </w:rPr>
           </w:pPr>
-          <w:hyperlink w:anchor="_Toc242880006" w:history="1">
+          <w:hyperlink w:anchor="_Toc242884373" w:history="1">
             <w:r>
               <w:rPr>
                 <w:rStyle w:val="Hyperlink"/>
@@ -1420,7 +1420,7 @@
               <w:rPr>
                 <w:noProof/>
               </w:rPr>
-              <w:instrText xml:space="preserve"> PAGEREF _Toc242880006 \h </w:instrText>
+              <w:instrText xml:space="preserve"> PAGEREF _Toc242884373 \h </w:instrText>
             </w:r>
             <w:r>
               <w:rPr>
@@ -1461,7 +1461,7 @@
               <w14:ligatures w14:val="standardContextual"/>
             </w:rPr>
           </w:pPr>
-          <w:hyperlink w:anchor="_Toc242880007" w:history="1">
+          <w:hyperlink w:anchor="_Toc242884374" w:history="1">
             <w:r>
               <w:rPr>
                 <w:rStyle w:val="Hyperlink"/>
@@ -1485,7 +1485,7 @@
               <w:rPr>
                 <w:noProof/>
               </w:rPr>
-              <w:instrText xml:space="preserve"> PAGEREF _Toc242880007 \h </w:instrText>
+              <w:instrText xml:space="preserve"> PAGEREF _Toc242884374 \h </w:instrText>
             </w:r>
             <w:r>
               <w:rPr>
@@ -1526,7 +1526,7 @@
               <w14:ligatures w14:val="standardContextual"/>
             </w:rPr>
           </w:pPr>
-          <w:hyperlink w:anchor="_Toc242880008" w:history="1">
+          <w:hyperlink w:anchor="_Toc242884375" w:history="1">
             <w:r>
               <w:rPr>
                 <w:rStyle w:val="Hyperlink"/>
@@ -1550,7 +1550,7 @@
               <w:rPr>
                 <w:noProof/>
               </w:rPr>
-              <w:instrText xml:space="preserve"> PAGEREF _Toc242880008 \h </w:instrText>
+              <w:instrText xml:space="preserve"> PAGEREF _Toc242884375 \h </w:instrText>
             </w:r>
             <w:r>
               <w:rPr>
@@ -1591,7 +1591,7 @@
               <w14:ligatures w14:val="standardContextual"/>
             </w:rPr>
           </w:pPr>
-          <w:hyperlink w:anchor="_Toc242880009" w:history="1">
+          <w:hyperlink w:anchor="_Toc242884376" w:history="1">
             <w:r>
               <w:rPr>
                 <w:rStyle w:val="Hyperlink"/>
@@ -1615,7 +1615,7 @@
               <w:rPr>
                 <w:noProof/>
               </w:rPr>
-              <w:instrText xml:space="preserve"> PAGEREF _Toc242880009 \h </w:instrText>
+              <w:instrText xml:space="preserve"> PAGEREF _Toc242884376 \h </w:instrText>
             </w:r>
             <w:r>
               <w:rPr>
@@ -1656,7 +1656,7 @@
               <w14:ligatures w14:val="standardContextual"/>
             </w:rPr>
           </w:pPr>
-          <w:hyperlink w:anchor="_Toc242880010" w:history="1">
+          <w:hyperlink w:anchor="_Toc242884377" w:history="1">
             <w:r>
               <w:rPr>
                 <w:rStyle w:val="Hyperlink"/>
@@ -1680,7 +1680,7 @@
               <w:rPr>
                 <w:noProof/>
               </w:rPr>
-              <w:instrText xml:space="preserve"> PAGEREF _Toc242880010 \h </w:instrText>
+              <w:instrText xml:space="preserve"> PAGEREF _Toc242884377 \h </w:instrText>
             </w:r>
             <w:r>
               <w:rPr>
@@ -1721,7 +1721,7 @@
               <w14:ligatures w14:val="standardContextual"/>
             </w:rPr>
           </w:pPr>
-          <w:hyperlink w:anchor="_Toc242880011" w:history="1">
+          <w:hyperlink w:anchor="_Toc242884378" w:history="1">
             <w:r>
               <w:rPr>
                 <w:rStyle w:val="Hyperlink"/>
@@ -1745,7 +1745,7 @@
               <w:rPr>
                 <w:noProof/>
               </w:rPr>
-              <w:instrText xml:space="preserve"> PAGEREF _Toc242880011 \h </w:instrText>
+              <w:instrText xml:space="preserve"> PAGEREF _Toc242884378 \h </w:instrText>
             </w:r>
             <w:r>
               <w:rPr>
@@ -1786,7 +1786,7 @@
               <w14:ligatures w14:val="standardContextual"/>
             </w:rPr>
           </w:pPr>
-          <w:hyperlink w:anchor="_Toc242880012" w:history="1">
+          <w:hyperlink w:anchor="_Toc242884379" w:history="1">
             <w:r>
               <w:rPr>
                 <w:rStyle w:val="Hyperlink"/>
@@ -1810,7 +1810,7 @@
               <w:rPr>
                 <w:noProof/>
               </w:rPr>
-              <w:instrText xml:space="preserve"> PAGEREF _Toc242880012 \h </w:instrText>
+              <w:instrText xml:space="preserve"> PAGEREF _Toc242884379 \h </w:instrText>
             </w:r>
             <w:r>
               <w:rPr>
@@ -1851,7 +1851,7 @@
               <w14:ligatures w14:val="standardContextual"/>
             </w:rPr>
           </w:pPr>
-          <w:hyperlink w:anchor="_Toc242880013" w:history="1">
+          <w:hyperlink w:anchor="_Toc242884380" w:history="1">
             <w:r>
               <w:rPr>
                 <w:rStyle w:val="Hyperlink"/>
@@ -1875,7 +1875,7 @@
               <w:rPr>
                 <w:noProof/>
               </w:rPr>
-              <w:instrText xml:space="preserve"> PAGEREF _Toc242880013 \h </w:instrText>
+              <w:instrText xml:space="preserve"> PAGEREF _Toc242884380 \h </w:instrText>
             </w:r>
             <w:r>
               <w:rPr>
@@ -1916,7 +1916,7 @@
               <w14:ligatures w14:val="standardContextual"/>
             </w:rPr>
           </w:pPr>
-          <w:hyperlink w:anchor="_Toc242880014" w:history="1">
+          <w:hyperlink w:anchor="_Toc242884381" w:history="1">
             <w:r>
               <w:rPr>
                 <w:rStyle w:val="Hyperlink"/>
@@ -1940,7 +1940,7 @@
               <w:rPr>
                 <w:noProof/>
               </w:rPr>
-              <w:instrText xml:space="preserve"> PAGEREF _Toc242880014 \h </w:instrText>
+              <w:instrText xml:space="preserve"> PAGEREF _Toc242884381 \h </w:instrText>
             </w:r>
             <w:r>
               <w:rPr>
@@ -1981,7 +1981,7 @@
               <w14:ligatures w14:val="standardContextual"/>
             </w:rPr>
           </w:pPr>
-          <w:hyperlink w:anchor="_Toc242880015" w:history="1">
+          <w:hyperlink w:anchor="_Toc242884382" w:history="1">
             <w:r>
               <w:rPr>
                 <w:rStyle w:val="Hyperlink"/>
@@ -2005,7 +2005,7 @@
               <w:rPr>
                 <w:noProof/>
               </w:rPr>
-              <w:instrText xml:space="preserve"> PAGEREF _Toc242880015 \h </w:instrText>
+              <w:instrText xml:space="preserve"> PAGEREF _Toc242884382 \h </w:instrText>
             </w:r>
             <w:r>
               <w:rPr>
@@ -2046,7 +2046,7 @@
               <w14:ligatures w14:val="standardContextual"/>
             </w:rPr>
           </w:pPr>
-          <w:hyperlink w:anchor="_Toc242880016" w:history="1">
+          <w:hyperlink w:anchor="_Toc242884383" w:history="1">
             <w:r>
               <w:rPr>
                 <w:rStyle w:val="Hyperlink"/>
@@ -2070,7 +2070,7 @@
               <w:rPr>
                 <w:noProof/>
               </w:rPr>
-              <w:instrText xml:space="preserve"> PAGEREF _Toc242880016 \h </w:instrText>
+              <w:instrText xml:space="preserve"> PAGEREF _Toc242884383 \h </w:instrText>
             </w:r>
             <w:r>
               <w:rPr>
@@ -2109,7 +2109,7 @@
         <w:pStyle w:val="Heading1"/>
         <w:pageBreakBefore/>
       </w:pPr>
-      <w:bookmarkStart w:id="0" w:name="_Toc242879988"/>
+      <w:bookmarkStart w:id="0" w:name="_Toc242884355"/>
       <w:r>
         <w:lastRenderedPageBreak/>
         <w:t>1. Introduction</w:t>
@@ -4611,7 +4611,7 @@
         <w:pStyle w:val="Heading1"/>
         <w:pageBreakBefore/>
       </w:pPr>
-      <w:bookmarkStart w:id="1" w:name="_Toc242879989"/>
+      <w:bookmarkStart w:id="1" w:name="_Toc242884356"/>
       <w:r>
         <w:lastRenderedPageBreak/>
         <w:t>2. The portals at a glance</w:t>
@@ -6891,7 +6891,7 @@
                 <w:sz w:val="21"/>
                 <w:szCs w:val="21"/>
               </w:rPr>
-              <w:t>Leave</w:t>
+              <w:t>Import (from a spreadsheet)</w:t>
             </w:r>
           </w:p>
         </w:tc>
@@ -6921,7 +6921,7 @@
                 <w:sz w:val="21"/>
                 <w:szCs w:val="21"/>
               </w:rPr>
-              <w:t>All staff</w:t>
+              <w:t>Administrator</w:t>
             </w:r>
           </w:p>
         </w:tc>
@@ -6955,7 +6955,7 @@
                 <w:sz w:val="21"/>
                 <w:szCs w:val="21"/>
               </w:rPr>
-              <w:t>Learning</w:t>
+              <w:t>People</w:t>
             </w:r>
           </w:p>
         </w:tc>
@@ -6984,7 +6984,7 @@
                 <w:sz w:val="21"/>
                 <w:szCs w:val="21"/>
               </w:rPr>
-              <w:t>Attendance</w:t>
+              <w:t>Leave</w:t>
             </w:r>
           </w:p>
         </w:tc>
@@ -7013,7 +7013,7 @@
                 <w:sz w:val="21"/>
                 <w:szCs w:val="21"/>
               </w:rPr>
-              <w:t>Administrator, Head Teacher, Teacher, Caregiver, Front Desk Officer</w:t>
+              <w:t>All staff</w:t>
             </w:r>
           </w:p>
         </w:tc>
@@ -7078,7 +7078,7 @@
                 <w:sz w:val="21"/>
                 <w:szCs w:val="21"/>
               </w:rPr>
-              <w:t>Marks</w:t>
+              <w:t>Attendance</w:t>
             </w:r>
           </w:p>
         </w:tc>
@@ -7108,7 +7108,7 @@
                 <w:sz w:val="21"/>
                 <w:szCs w:val="21"/>
               </w:rPr>
-              <w:t>Teacher</w:t>
+              <w:t>Administrator, Head Teacher, Teacher, Caregiver, Front Desk Officer</w:t>
             </w:r>
           </w:p>
         </w:tc>
@@ -7171,7 +7171,7 @@
                 <w:sz w:val="21"/>
                 <w:szCs w:val="21"/>
               </w:rPr>
-              <w:t>Results</w:t>
+              <w:t>Marks</w:t>
             </w:r>
           </w:p>
         </w:tc>
@@ -7200,7 +7200,7 @@
                 <w:sz w:val="21"/>
                 <w:szCs w:val="21"/>
               </w:rPr>
-              <w:t>Administrator, Head Teacher</w:t>
+              <w:t>Teacher</w:t>
             </w:r>
           </w:p>
         </w:tc>
@@ -7265,7 +7265,7 @@
                 <w:sz w:val="21"/>
                 <w:szCs w:val="21"/>
               </w:rPr>
-              <w:t>Lesson notes</w:t>
+              <w:t>Results</w:t>
             </w:r>
           </w:p>
         </w:tc>
@@ -7295,7 +7295,7 @@
                 <w:sz w:val="21"/>
                 <w:szCs w:val="21"/>
               </w:rPr>
-              <w:t>Administrator, Head Teacher, Teacher, Caregiver</w:t>
+              <w:t>Administrator, Head Teacher</w:t>
             </w:r>
           </w:p>
         </w:tc>
@@ -7358,7 +7358,7 @@
                 <w:sz w:val="21"/>
                 <w:szCs w:val="21"/>
               </w:rPr>
-              <w:t>Timetable</w:t>
+              <w:t>Lesson notes</w:t>
             </w:r>
           </w:p>
         </w:tc>
@@ -7452,7 +7452,7 @@
                 <w:sz w:val="21"/>
                 <w:szCs w:val="21"/>
               </w:rPr>
-              <w:t>Resources</w:t>
+              <w:t>Timetable</w:t>
             </w:r>
           </w:p>
         </w:tc>
@@ -7545,7 +7545,7 @@
                 <w:sz w:val="21"/>
                 <w:szCs w:val="21"/>
               </w:rPr>
-              <w:t>Quizzes</w:t>
+              <w:t>Resources</w:t>
             </w:r>
           </w:p>
         </w:tc>
@@ -7574,7 +7574,7 @@
                 <w:sz w:val="21"/>
                 <w:szCs w:val="21"/>
               </w:rPr>
-              <w:t>Teacher</w:t>
+              <w:t>Administrator, Head Teacher, Teacher, Caregiver</w:t>
             </w:r>
           </w:p>
         </w:tc>
@@ -7639,7 +7639,7 @@
                 <w:sz w:val="21"/>
                 <w:szCs w:val="21"/>
               </w:rPr>
-              <w:t>Daily care</w:t>
+              <w:t>Quizzes</w:t>
             </w:r>
           </w:p>
         </w:tc>
@@ -7669,7 +7669,7 @@
                 <w:sz w:val="21"/>
                 <w:szCs w:val="21"/>
               </w:rPr>
-              <w:t>Teacher, Caregiver, Administrator, Head Teacher</w:t>
+              <w:t>Teacher</w:t>
             </w:r>
           </w:p>
         </w:tc>
@@ -7703,7 +7703,7 @@
                 <w:sz w:val="21"/>
                 <w:szCs w:val="21"/>
               </w:rPr>
-              <w:t>Money</w:t>
+              <w:t>Learning</w:t>
             </w:r>
           </w:p>
         </w:tc>
@@ -7732,7 +7732,7 @@
                 <w:sz w:val="21"/>
                 <w:szCs w:val="21"/>
               </w:rPr>
-              <w:t>Money</w:t>
+              <w:t>Daily care</w:t>
             </w:r>
           </w:p>
         </w:tc>
@@ -7761,7 +7761,7 @@
                 <w:sz w:val="21"/>
                 <w:szCs w:val="21"/>
               </w:rPr>
-              <w:t>Accountant, Administrator, Head Teacher, Proprietor</w:t>
+              <w:t>Teacher, Caregiver, Administrator, Head Teacher</w:t>
             </w:r>
           </w:p>
         </w:tc>
@@ -7826,7 +7826,7 @@
                 <w:sz w:val="21"/>
                 <w:szCs w:val="21"/>
               </w:rPr>
-              <w:t>Daily charges</w:t>
+              <w:t>Money</w:t>
             </w:r>
           </w:p>
         </w:tc>
@@ -7856,7 +7856,7 @@
                 <w:sz w:val="21"/>
                 <w:szCs w:val="21"/>
               </w:rPr>
-              <w:t>Accountant, Administrator, Head Teacher, Proprietor, Canteen Officer, Teacher</w:t>
+              <w:t>Accountant, Administrator, Head Teacher, Proprietor</w:t>
             </w:r>
           </w:p>
         </w:tc>
@@ -7919,7 +7919,7 @@
                 <w:sz w:val="21"/>
                 <w:szCs w:val="21"/>
               </w:rPr>
-              <w:t>Billing</w:t>
+              <w:t>Daily charges</w:t>
             </w:r>
           </w:p>
         </w:tc>
@@ -7948,7 +7948,7 @@
                 <w:sz w:val="21"/>
                 <w:szCs w:val="21"/>
               </w:rPr>
-              <w:t>Administrator, Proprietor, Accountant</w:t>
+              <w:t>Accountant, Administrator, Head Teacher, Proprietor, Canteen Officer, Teacher</w:t>
             </w:r>
           </w:p>
         </w:tc>
@@ -7983,7 +7983,7 @@
                 <w:sz w:val="21"/>
                 <w:szCs w:val="21"/>
               </w:rPr>
-              <w:t>Services</w:t>
+              <w:t>Money</w:t>
             </w:r>
           </w:p>
         </w:tc>
@@ -8013,7 +8013,7 @@
                 <w:sz w:val="21"/>
                 <w:szCs w:val="21"/>
               </w:rPr>
-              <w:t>Gate</w:t>
+              <w:t>Billing</w:t>
             </w:r>
           </w:p>
         </w:tc>
@@ -8043,7 +8043,7 @@
                 <w:sz w:val="21"/>
                 <w:szCs w:val="21"/>
               </w:rPr>
-              <w:t>Front Desk Officer, Administrator, Head Teacher</w:t>
+              <w:t>Administrator, Proprietor, Accountant</w:t>
             </w:r>
           </w:p>
         </w:tc>
@@ -8106,7 +8106,7 @@
                 <w:sz w:val="21"/>
                 <w:szCs w:val="21"/>
               </w:rPr>
-              <w:t>Health</w:t>
+              <w:t>Gate</w:t>
             </w:r>
           </w:p>
         </w:tc>
@@ -8135,7 +8135,7 @@
                 <w:sz w:val="21"/>
                 <w:szCs w:val="21"/>
               </w:rPr>
-              <w:t>School Nurse, Administrator, Head Teacher</w:t>
+              <w:t>Front Desk Officer, Administrator, Head Teacher</w:t>
             </w:r>
           </w:p>
         </w:tc>
@@ -8200,7 +8200,7 @@
                 <w:sz w:val="21"/>
                 <w:szCs w:val="21"/>
               </w:rPr>
-              <w:t>Transport</w:t>
+              <w:t>Health</w:t>
             </w:r>
           </w:p>
         </w:tc>
@@ -8230,7 +8230,7 @@
                 <w:sz w:val="21"/>
                 <w:szCs w:val="21"/>
               </w:rPr>
-              <w:t>Transport Officer, Administrator, Head Teacher</w:t>
+              <w:t>School Nurse, Administrator, Head Teacher</w:t>
             </w:r>
           </w:p>
         </w:tc>
@@ -8293,7 +8293,7 @@
                 <w:sz w:val="21"/>
                 <w:szCs w:val="21"/>
               </w:rPr>
-              <w:t>Shop</w:t>
+              <w:t>Transport</w:t>
             </w:r>
           </w:p>
         </w:tc>
@@ -8322,7 +8322,7 @@
                 <w:sz w:val="21"/>
                 <w:szCs w:val="21"/>
               </w:rPr>
-              <w:t>Bookshop Keeper, Accountant, Administrator, Head Teacher</w:t>
+              <w:t>Transport Officer, Administrator, Head Teacher</w:t>
             </w:r>
           </w:p>
         </w:tc>
@@ -8357,7 +8357,7 @@
                 <w:sz w:val="21"/>
                 <w:szCs w:val="21"/>
               </w:rPr>
-              <w:t>School</w:t>
+              <w:t>Services</w:t>
             </w:r>
           </w:p>
         </w:tc>
@@ -8387,7 +8387,7 @@
                 <w:sz w:val="21"/>
                 <w:szCs w:val="21"/>
               </w:rPr>
-              <w:t>Messages</w:t>
+              <w:t>Shop</w:t>
             </w:r>
           </w:p>
         </w:tc>
@@ -8417,7 +8417,7 @@
                 <w:sz w:val="21"/>
                 <w:szCs w:val="21"/>
               </w:rPr>
-              <w:t>Administrator, Head Teacher</w:t>
+              <w:t>Bookshop Keeper, Accountant, Administrator, Head Teacher</w:t>
             </w:r>
           </w:p>
         </w:tc>
@@ -8480,7 +8480,7 @@
                 <w:sz w:val="21"/>
                 <w:szCs w:val="21"/>
               </w:rPr>
-              <w:t>Website</w:t>
+              <w:t>Messages</w:t>
             </w:r>
           </w:p>
         </w:tc>
@@ -8574,7 +8574,7 @@
                 <w:sz w:val="21"/>
                 <w:szCs w:val="21"/>
               </w:rPr>
-              <w:t>School setup</w:t>
+              <w:t>Website</w:t>
             </w:r>
           </w:p>
         </w:tc>
@@ -8604,7 +8604,7 @@
                 <w:sz w:val="21"/>
                 <w:szCs w:val="21"/>
               </w:rPr>
-              <w:t>Administrator (changes); Head Teacher (reads)</w:t>
+              <w:t>Administrator, Head Teacher</w:t>
             </w:r>
           </w:p>
         </w:tc>
@@ -8667,7 +8667,7 @@
                 <w:sz w:val="21"/>
                 <w:szCs w:val="21"/>
               </w:rPr>
-              <w:t>Support</w:t>
+              <w:t>School setup</w:t>
             </w:r>
           </w:p>
         </w:tc>
@@ -8696,7 +8696,7 @@
                 <w:sz w:val="21"/>
                 <w:szCs w:val="21"/>
               </w:rPr>
-              <w:t>Administrator, Head Teacher</w:t>
+              <w:t>Administrator (changes); Head Teacher (reads)</w:t>
             </w:r>
           </w:p>
         </w:tc>
@@ -8761,7 +8761,7 @@
                 <w:sz w:val="21"/>
                 <w:szCs w:val="21"/>
               </w:rPr>
-              <w:t>Year end</w:t>
+              <w:t>Support</w:t>
             </w:r>
           </w:p>
         </w:tc>
@@ -8854,7 +8854,7 @@
                 <w:sz w:val="21"/>
                 <w:szCs w:val="21"/>
               </w:rPr>
-              <w:t>Reports</w:t>
+              <w:t>Year end</w:t>
             </w:r>
           </w:p>
         </w:tc>
@@ -8883,7 +8883,7 @@
                 <w:sz w:val="21"/>
                 <w:szCs w:val="21"/>
               </w:rPr>
-              <w:t>Administrator, Head Teacher, Proprietor, Accountant</w:t>
+              <w:t>Administrator, Head Teacher</w:t>
             </w:r>
           </w:p>
         </w:tc>
@@ -8948,7 +8948,7 @@
                 <w:sz w:val="21"/>
                 <w:szCs w:val="21"/>
               </w:rPr>
-              <w:t>Audit log</w:t>
+              <w:t>Reports</w:t>
             </w:r>
           </w:p>
         </w:tc>
@@ -8978,7 +8978,7 @@
                 <w:sz w:val="21"/>
                 <w:szCs w:val="21"/>
               </w:rPr>
-              <w:t>Administrator, Head Teacher</w:t>
+              <w:t>Administrator, Head Teacher, Proprietor, Accountant</w:t>
             </w:r>
           </w:p>
         </w:tc>
@@ -9012,7 +9012,7 @@
                 <w:sz w:val="21"/>
                 <w:szCs w:val="21"/>
               </w:rPr>
-              <w:t>—</w:t>
+              <w:t>School</w:t>
             </w:r>
           </w:p>
         </w:tc>
@@ -9041,7 +9041,7 @@
                 <w:sz w:val="21"/>
                 <w:szCs w:val="21"/>
               </w:rPr>
-              <w:t>Account</w:t>
+              <w:t>Audit log</w:t>
             </w:r>
           </w:p>
         </w:tc>
@@ -9070,7 +9070,7 @@
                 <w:sz w:val="21"/>
                 <w:szCs w:val="21"/>
               </w:rPr>
-              <w:t>Every staff member and pupil (parents find it under More)</w:t>
+              <w:t>Administrator, Head Teacher</w:t>
             </w:r>
           </w:p>
         </w:tc>
@@ -9105,7 +9105,7 @@
                 <w:sz w:val="21"/>
                 <w:szCs w:val="21"/>
               </w:rPr>
-              <w:t>Parent tabs</w:t>
+              <w:t>—</w:t>
             </w:r>
           </w:p>
         </w:tc>
@@ -9135,7 +9135,7 @@
                 <w:sz w:val="21"/>
                 <w:szCs w:val="21"/>
               </w:rPr>
-              <w:t>Home, My wards, Payments, Consent, More</w:t>
+              <w:t>Account</w:t>
             </w:r>
           </w:p>
         </w:tc>
@@ -9165,7 +9165,7 @@
                 <w:sz w:val="21"/>
                 <w:szCs w:val="21"/>
               </w:rPr>
-              <w:t>Parent</w:t>
+              <w:t>Every staff member and pupil (parents find it under More)</w:t>
             </w:r>
           </w:p>
         </w:tc>
@@ -9199,6 +9199,100 @@
                 <w:sz w:val="21"/>
                 <w:szCs w:val="21"/>
               </w:rPr>
+              <w:t>Parent tabs</w:t>
+            </w:r>
+          </w:p>
+        </w:tc>
+        <w:tc>
+          <w:tcPr>
+            <w:tcW w:w="2707" w:type="dxa"/>
+            <w:tcBorders>
+              <w:top w:val="single" w:sz="4" w:space="0" w:color="C8CBE0"/>
+              <w:left w:val="single" w:sz="4" w:space="0" w:color="C8CBE0"/>
+              <w:bottom w:val="single" w:sz="4" w:space="0" w:color="C8CBE0"/>
+              <w:right w:val="single" w:sz="4" w:space="0" w:color="C8CBE0"/>
+            </w:tcBorders>
+            <w:tcMar>
+              <w:top w:w="60" w:type="dxa"/>
+              <w:left w:w="100" w:type="dxa"/>
+              <w:bottom w:w="60" w:type="dxa"/>
+              <w:right w:w="100" w:type="dxa"/>
+            </w:tcMar>
+          </w:tcPr>
+          <w:p>
+            <w:pPr>
+              <w:spacing w:after="20"/>
+            </w:pPr>
+            <w:r>
+              <w:rPr>
+                <w:sz w:val="21"/>
+                <w:szCs w:val="21"/>
+              </w:rPr>
+              <w:t>Home, My wards, Payments, Consent, More</w:t>
+            </w:r>
+          </w:p>
+        </w:tc>
+        <w:tc>
+          <w:tcPr>
+            <w:tcW w:w="4785" w:type="dxa"/>
+            <w:tcBorders>
+              <w:top w:val="single" w:sz="4" w:space="0" w:color="C8CBE0"/>
+              <w:left w:val="single" w:sz="4" w:space="0" w:color="C8CBE0"/>
+              <w:bottom w:val="single" w:sz="4" w:space="0" w:color="C8CBE0"/>
+              <w:right w:val="single" w:sz="4" w:space="0" w:color="C8CBE0"/>
+            </w:tcBorders>
+            <w:tcMar>
+              <w:top w:w="60" w:type="dxa"/>
+              <w:left w:w="100" w:type="dxa"/>
+              <w:bottom w:w="60" w:type="dxa"/>
+              <w:right w:w="100" w:type="dxa"/>
+            </w:tcMar>
+          </w:tcPr>
+          <w:p>
+            <w:pPr>
+              <w:spacing w:after="20"/>
+            </w:pPr>
+            <w:r>
+              <w:rPr>
+                <w:sz w:val="21"/>
+                <w:szCs w:val="21"/>
+              </w:rPr>
+              <w:t>Parent</w:t>
+            </w:r>
+          </w:p>
+        </w:tc>
+      </w:tr>
+      <w:tr>
+        <w:trPr>
+          <w:cantSplit/>
+        </w:trPr>
+        <w:tc>
+          <w:tcPr>
+            <w:tcW w:w="1534" w:type="dxa"/>
+            <w:tcBorders>
+              <w:top w:val="single" w:sz="4" w:space="0" w:color="C8CBE0"/>
+              <w:left w:val="single" w:sz="4" w:space="0" w:color="C8CBE0"/>
+              <w:bottom w:val="single" w:sz="4" w:space="0" w:color="C8CBE0"/>
+              <w:right w:val="single" w:sz="4" w:space="0" w:color="C8CBE0"/>
+            </w:tcBorders>
+            <w:shd w:val="clear" w:color="auto" w:fill="EEF0FB"/>
+            <w:tcMar>
+              <w:top w:w="60" w:type="dxa"/>
+              <w:left w:w="100" w:type="dxa"/>
+              <w:bottom w:w="60" w:type="dxa"/>
+              <w:right w:w="100" w:type="dxa"/>
+            </w:tcMar>
+          </w:tcPr>
+          <w:p>
+            <w:pPr>
+              <w:spacing w:after="20"/>
+            </w:pPr>
+            <w:r>
+              <w:rPr>
+                <w:sz w:val="21"/>
+                <w:szCs w:val="21"/>
+              </w:rPr>
+              <w:lastRenderedPageBreak/>
               <w:t>Pupil menu</w:t>
             </w:r>
           </w:p>
@@ -9212,6 +9306,7 @@
               <w:bottom w:val="single" w:sz="4" w:space="0" w:color="C8CBE0"/>
               <w:right w:val="single" w:sz="4" w:space="0" w:color="C8CBE0"/>
             </w:tcBorders>
+            <w:shd w:val="clear" w:color="auto" w:fill="EEF0FB"/>
             <w:tcMar>
               <w:top w:w="60" w:type="dxa"/>
               <w:left w:w="100" w:type="dxa"/>
@@ -9241,6 +9336,7 @@
               <w:bottom w:val="single" w:sz="4" w:space="0" w:color="C8CBE0"/>
               <w:right w:val="single" w:sz="4" w:space="0" w:color="C8CBE0"/>
             </w:tcBorders>
+            <w:shd w:val="clear" w:color="auto" w:fill="EEF0FB"/>
             <w:tcMar>
               <w:top w:w="60" w:type="dxa"/>
               <w:left w:w="100" w:type="dxa"/>
@@ -9282,7 +9378,6 @@
           <w:b/>
           <w:bCs/>
         </w:rPr>
-        <w:lastRenderedPageBreak/>
         <w:t>Restricted records</w:t>
       </w:r>
       <w:r>
@@ -9294,7 +9389,7 @@
         <w:pStyle w:val="Heading1"/>
         <w:pageBreakBefore/>
       </w:pPr>
-      <w:bookmarkStart w:id="2" w:name="_Toc242879990"/>
+      <w:bookmarkStart w:id="2" w:name="_Toc242884357"/>
       <w:r>
         <w:lastRenderedPageBreak/>
         <w:t>3. Signing in and keeping accounts safe</w:t>
@@ -10379,7 +10474,7 @@
         <w:pStyle w:val="Heading1"/>
         <w:pageBreakBefore/>
       </w:pPr>
-      <w:bookmarkStart w:id="3" w:name="_Toc242879991"/>
+      <w:bookmarkStart w:id="3" w:name="_Toc242884358"/>
       <w:r>
         <w:lastRenderedPageBreak/>
         <w:t>4. Administrator portal</w:t>
@@ -11063,7 +11158,7 @@
         <w:pStyle w:val="Heading2"/>
       </w:pPr>
       <w:r>
-        <w:t>4.5 Enrolment</w:t>
+        <w:t>4.5 Enrolment and importing from a spreadsheet</w:t>
       </w:r>
     </w:p>
     <w:p>
@@ -11077,10 +11172,129 @@
     </w:p>
     <w:p>
       <w:pPr>
+        <w:spacing w:after="120"/>
+        <w:jc w:val="both"/>
+      </w:pPr>
+      <w:r>
+        <w:t xml:space="preserve">A school joining with hundreds of pupils doesn't type them in one by one. Under </w:t>
+      </w:r>
+      <w:r>
+        <w:rPr>
+          <w:b/>
+          <w:bCs/>
+        </w:rPr>
+        <w:t>Import</w:t>
+      </w:r>
+      <w:r>
+        <w:t>, the Administrator downloads a template, fills it in with Excel or Google Sheets, and uploads it (Excel .xlsx or CSV):</w:t>
+      </w:r>
+    </w:p>
+    <w:p>
+      <w:pPr>
+        <w:pStyle w:val="ListParagraph"/>
+        <w:numPr>
+          <w:ilvl w:val="0"/>
+          <w:numId w:val="2"/>
+        </w:numPr>
+        <w:spacing w:after="60"/>
+      </w:pPr>
+      <w:r>
+        <w:rPr>
+          <w:b/>
+          <w:bCs/>
+        </w:rPr>
+        <w:lastRenderedPageBreak/>
+        <w:t>Pupils with their parents and class:</w:t>
+      </w:r>
+      <w:r>
+        <w:t xml:space="preserve"> names, date of birth, gender, class, admission details, and up to two parents with their phone numbers.</w:t>
+      </w:r>
+    </w:p>
+    <w:p>
+      <w:pPr>
+        <w:pStyle w:val="ListParagraph"/>
+        <w:numPr>
+          <w:ilvl w:val="0"/>
+          <w:numId w:val="2"/>
+        </w:numPr>
+        <w:spacing w:after="60"/>
+      </w:pPr>
+      <w:r>
+        <w:rPr>
+          <w:b/>
+          <w:bCs/>
+        </w:rPr>
+        <w:t>Staff with their roles:</w:t>
+      </w:r>
+      <w:r>
+        <w:t xml:space="preserve"> name, username, roles, phone and email; each new member of staff receives a one-time password, shown once as a printable list.</w:t>
+      </w:r>
+    </w:p>
+    <w:p>
+      <w:pPr>
+        <w:pStyle w:val="ListParagraph"/>
+        <w:numPr>
+          <w:ilvl w:val="0"/>
+          <w:numId w:val="2"/>
+        </w:numPr>
+        <w:spacing w:after="60"/>
+      </w:pPr>
+      <w:r>
+        <w:rPr>
+          <w:b/>
+          <w:bCs/>
+        </w:rPr>
+        <w:t>Checked first:</w:t>
+      </w:r>
+      <w:r>
+        <w:t xml:space="preserve"> the whole file is checked and every problem is listed by its spreadsheet row (for example, "Row 14: Date of birth: write dates as DD/MM/YYYY"). Nothing is saved until every row is right; then everything is saved together.</w:t>
+      </w:r>
+    </w:p>
+    <w:p>
+      <w:pPr>
+        <w:pStyle w:val="ListParagraph"/>
+        <w:numPr>
+          <w:ilvl w:val="0"/>
+          <w:numId w:val="2"/>
+        </w:numPr>
+        <w:spacing w:after="60"/>
+      </w:pPr>
+      <w:r>
+        <w:rPr>
+          <w:b/>
+          <w:bCs/>
+        </w:rPr>
+        <w:t>Smart about families:</w:t>
+      </w:r>
+      <w:r>
+        <w:t xml:space="preserve"> brothers and sisters who share a parent's phone number share one parent account, a parent already registered is linked rather than duplicated, and the parents listed become the pupil's emergency contacts.</w:t>
+      </w:r>
+    </w:p>
+    <w:p>
+      <w:pPr>
+        <w:pStyle w:val="ListParagraph"/>
+        <w:numPr>
+          <w:ilvl w:val="0"/>
+          <w:numId w:val="2"/>
+        </w:numPr>
+        <w:spacing w:after="60"/>
+      </w:pPr>
+      <w:r>
+        <w:rPr>
+          <w:b/>
+          <w:bCs/>
+        </w:rPr>
+        <w:t>Safe from mistakes:</w:t>
+      </w:r>
+      <w:r>
+        <w:t xml:space="preserve"> a pupil already at the school, or listed twice, is caught; up to 500 rows per file.</w:t>
+      </w:r>
+    </w:p>
+    <w:p>
+      <w:pPr>
         <w:pStyle w:val="Heading2"/>
       </w:pPr>
       <w:r>
-        <w:lastRenderedPageBreak/>
         <w:t>4.6 Staff</w:t>
       </w:r>
     </w:p>
@@ -11390,6 +11604,7 @@
           <w:b/>
           <w:bCs/>
         </w:rPr>
+        <w:lastRenderedPageBreak/>
         <w:t>Reports:</w:t>
       </w:r>
       <w:r>
@@ -11450,7 +11665,7 @@
         <w:pStyle w:val="Heading1"/>
         <w:spacing w:before="480"/>
       </w:pPr>
-      <w:bookmarkStart w:id="4" w:name="_Toc242879992"/>
+      <w:bookmarkStart w:id="4" w:name="_Toc242884359"/>
       <w:r>
         <w:t>5. Head Teacher portal</w:t>
       </w:r>
@@ -11470,7 +11685,6 @@
         <w:pStyle w:val="Heading2"/>
       </w:pPr>
       <w:r>
-        <w:lastRenderedPageBreak/>
         <w:t>5.1 What the Head Teacher sees</w:t>
       </w:r>
     </w:p>
@@ -12229,6 +12443,7 @@
         <w:pStyle w:val="Heading2"/>
       </w:pPr>
       <w:r>
+        <w:lastRenderedPageBreak/>
         <w:t>5.3 Alerts the Head Teacher receives</w:t>
       </w:r>
     </w:p>
@@ -12276,7 +12491,7 @@
         <w:pStyle w:val="Heading1"/>
         <w:spacing w:before="480"/>
       </w:pPr>
-      <w:bookmarkStart w:id="5" w:name="_Toc242879993"/>
+      <w:bookmarkStart w:id="5" w:name="_Toc242884360"/>
       <w:r>
         <w:t>6. Proprietor portal</w:t>
       </w:r>
@@ -12332,7 +12547,6 @@
         <w:spacing w:after="60"/>
       </w:pPr>
       <w:r>
-        <w:lastRenderedPageBreak/>
         <w:t>Money collected, fees still owed and how many pupils owe, as on the leaders' dashboard.</w:t>
       </w:r>
     </w:p>
@@ -12489,7 +12703,7 @@
         <w:pStyle w:val="Heading1"/>
         <w:spacing w:before="480"/>
       </w:pPr>
-      <w:bookmarkStart w:id="6" w:name="_Toc242879994"/>
+      <w:bookmarkStart w:id="6" w:name="_Toc242884361"/>
       <w:r>
         <w:t>7. Accountant portal</w:t>
       </w:r>
@@ -12576,6 +12790,7 @@
           <w:b/>
           <w:bCs/>
         </w:rPr>
+        <w:lastRenderedPageBreak/>
         <w:t>Discounts and scholarships</w:t>
       </w:r>
       <w:r>
@@ -12704,7 +12919,6 @@
           <w:b/>
           <w:bCs/>
         </w:rPr>
-        <w:lastRenderedPageBreak/>
         <w:t>Search</w:t>
       </w:r>
       <w:r>
@@ -12918,7 +13132,7 @@
         <w:pStyle w:val="Heading1"/>
         <w:pageBreakBefore/>
       </w:pPr>
-      <w:bookmarkStart w:id="7" w:name="_Toc242879995"/>
+      <w:bookmarkStart w:id="7" w:name="_Toc242884362"/>
       <w:r>
         <w:lastRenderedPageBreak/>
         <w:t>8. Teacher portal</w:t>
@@ -13504,7 +13718,7 @@
         <w:pStyle w:val="Heading1"/>
         <w:spacing w:before="480"/>
       </w:pPr>
-      <w:bookmarkStart w:id="8" w:name="_Toc242879996"/>
+      <w:bookmarkStart w:id="8" w:name="_Toc242884363"/>
       <w:r>
         <w:t>9. Early Years Caregiver portal</w:t>
       </w:r>
@@ -13730,7 +13944,7 @@
         <w:pStyle w:val="Heading1"/>
         <w:spacing w:before="480"/>
       </w:pPr>
-      <w:bookmarkStart w:id="9" w:name="_Toc242879997"/>
+      <w:bookmarkStart w:id="9" w:name="_Toc242884364"/>
       <w:r>
         <w:t>10. Front Desk Officer portal</w:t>
       </w:r>
@@ -13878,7 +14092,7 @@
         <w:pStyle w:val="Heading1"/>
         <w:spacing w:before="480"/>
       </w:pPr>
-      <w:bookmarkStart w:id="10" w:name="_Toc242879998"/>
+      <w:bookmarkStart w:id="10" w:name="_Toc242884365"/>
       <w:r>
         <w:lastRenderedPageBreak/>
         <w:t>11. School Nurse portal</w:t>
@@ -14003,7 +14217,7 @@
         <w:pStyle w:val="Heading1"/>
         <w:spacing w:before="480"/>
       </w:pPr>
-      <w:bookmarkStart w:id="11" w:name="_Toc242879999"/>
+      <w:bookmarkStart w:id="11" w:name="_Toc242884366"/>
       <w:r>
         <w:t>12. Bookshop Keeper portal</w:t>
       </w:r>
@@ -14182,7 +14396,7 @@
         <w:pStyle w:val="Heading1"/>
         <w:spacing w:before="480"/>
       </w:pPr>
-      <w:bookmarkStart w:id="12" w:name="_Toc242880000"/>
+      <w:bookmarkStart w:id="12" w:name="_Toc242884367"/>
       <w:r>
         <w:t>13. Canteen Officer portal</w:t>
       </w:r>
@@ -14340,7 +14554,7 @@
         <w:pStyle w:val="Heading1"/>
         <w:spacing w:before="480"/>
       </w:pPr>
-      <w:bookmarkStart w:id="13" w:name="_Toc242880001"/>
+      <w:bookmarkStart w:id="13" w:name="_Toc242884368"/>
       <w:r>
         <w:t>14. Transport Officer portal</w:t>
       </w:r>
@@ -14490,7 +14704,7 @@
         <w:pStyle w:val="Heading1"/>
         <w:pageBreakBefore/>
       </w:pPr>
-      <w:bookmarkStart w:id="14" w:name="_Toc242880002"/>
+      <w:bookmarkStart w:id="14" w:name="_Toc242884369"/>
       <w:r>
         <w:lastRenderedPageBreak/>
         <w:t>15. Parent portal</w:t>
@@ -15290,7 +15504,7 @@
         <w:pStyle w:val="Heading1"/>
         <w:spacing w:before="480"/>
       </w:pPr>
-      <w:bookmarkStart w:id="15" w:name="_Toc242880003"/>
+      <w:bookmarkStart w:id="15" w:name="_Toc242884370"/>
       <w:r>
         <w:t>16. Pupil portal (Basic 4 and above)</w:t>
       </w:r>
@@ -15798,7 +16012,7 @@
         <w:pStyle w:val="Heading1"/>
         <w:pageBreakBefore/>
       </w:pPr>
-      <w:bookmarkStart w:id="16" w:name="_Toc242880004"/>
+      <w:bookmarkStart w:id="16" w:name="_Toc242884371"/>
       <w:r>
         <w:lastRenderedPageBreak/>
         <w:t>17. ADsmartschool team portal</w:t>
@@ -16596,7 +16810,7 @@
         <w:pStyle w:val="Heading1"/>
         <w:pageBreakBefore/>
       </w:pPr>
-      <w:bookmarkStart w:id="17" w:name="_Toc242880005"/>
+      <w:bookmarkStart w:id="17" w:name="_Toc242884372"/>
       <w:r>
         <w:lastRenderedPageBreak/>
         <w:t>18. Your school's public website</w:t>
@@ -17304,7 +17518,7 @@
         <w:pStyle w:val="Heading1"/>
         <w:pageBreakBefore/>
       </w:pPr>
-      <w:bookmarkStart w:id="18" w:name="_Toc242880006"/>
+      <w:bookmarkStart w:id="18" w:name="_Toc242884373"/>
       <w:r>
         <w:lastRenderedPageBreak/>
         <w:t>19. Money and payments in depth</w:t>
@@ -18672,7 +18886,7 @@
         <w:pStyle w:val="Heading1"/>
         <w:spacing w:before="480"/>
       </w:pPr>
-      <w:bookmarkStart w:id="19" w:name="_Toc242880007"/>
+      <w:bookmarkStart w:id="19" w:name="_Toc242884374"/>
       <w:r>
         <w:t>20. Results and report cards</w:t>
       </w:r>
@@ -19406,7 +19620,7 @@
         <w:pStyle w:val="Heading1"/>
         <w:spacing w:before="480"/>
       </w:pPr>
-      <w:bookmarkStart w:id="20" w:name="_Toc242880008"/>
+      <w:bookmarkStart w:id="20" w:name="_Toc242884375"/>
       <w:r>
         <w:t>21. Care, safeguarding and health</w:t>
       </w:r>
@@ -20395,7 +20609,7 @@
         <w:pStyle w:val="Heading1"/>
         <w:spacing w:before="480"/>
       </w:pPr>
-      <w:bookmarkStart w:id="21" w:name="_Toc242880009"/>
+      <w:bookmarkStart w:id="21" w:name="_Toc242884376"/>
       <w:r>
         <w:t>22. Messages and notifications</w:t>
       </w:r>
@@ -21830,7 +22044,7 @@
         <w:pStyle w:val="Heading1"/>
         <w:spacing w:before="480"/>
       </w:pPr>
-      <w:bookmarkStart w:id="22" w:name="_Toc242880010"/>
+      <w:bookmarkStart w:id="22" w:name="_Toc242884377"/>
       <w:r>
         <w:t>23. Attendance, staff and leave</w:t>
       </w:r>
@@ -21988,7 +22202,7 @@
         <w:pStyle w:val="Heading1"/>
         <w:spacing w:before="480"/>
       </w:pPr>
-      <w:bookmarkStart w:id="23" w:name="_Toc242880011"/>
+      <w:bookmarkStart w:id="23" w:name="_Toc242884378"/>
       <w:r>
         <w:t>24. Reports, dashboards and year end</w:t>
       </w:r>
@@ -22922,7 +23136,7 @@
         <w:pStyle w:val="Heading1"/>
         <w:pageBreakBefore/>
       </w:pPr>
-      <w:bookmarkStart w:id="24" w:name="_Toc242880012"/>
+      <w:bookmarkStart w:id="24" w:name="_Toc242884379"/>
       <w:r>
         <w:lastRenderedPageBreak/>
         <w:t>25. Security and privacy</w:t>
@@ -23208,7 +23422,7 @@
         <w:pStyle w:val="Heading1"/>
         <w:pageBreakBefore/>
       </w:pPr>
-      <w:bookmarkStart w:id="25" w:name="_Toc242880013"/>
+      <w:bookmarkStart w:id="25" w:name="_Toc242884380"/>
       <w:r>
         <w:lastRenderedPageBreak/>
         <w:t>26. Pricing and subscription</w:t>
@@ -24106,7 +24320,7 @@
         <w:pStyle w:val="Heading1"/>
         <w:spacing w:before="480"/>
       </w:pPr>
-      <w:bookmarkStart w:id="26" w:name="_Toc242880014"/>
+      <w:bookmarkStart w:id="26" w:name="_Toc242884381"/>
       <w:r>
         <w:t>27. Technology and hosting</w:t>
       </w:r>
@@ -24917,7 +25131,7 @@
         <w:pStyle w:val="Heading1"/>
         <w:pageBreakBefore/>
       </w:pPr>
-      <w:bookmarkStart w:id="27" w:name="_Toc242880015"/>
+      <w:bookmarkStart w:id="27" w:name="_Toc242884382"/>
       <w:r>
         <w:lastRenderedPageBreak/>
         <w:t>28. Getting started</w:t>
@@ -25026,10 +25240,10 @@
           <w:b/>
           <w:bCs/>
         </w:rPr>
-        <w:t>Add pupils and parents,</w:t>
-      </w:r>
-      <w:r>
-        <w:t xml:space="preserve"> place pupils in classes and send parents their activation texts.</w:t>
+        <w:t>Add pupils, parents and staff,</w:t>
+      </w:r>
+      <w:r>
+        <w:t xml:space="preserve"> one by one or all at once from a spreadsheet, place pupils in classes, and send parents their activation texts.</w:t>
       </w:r>
     </w:p>
     <w:p>
@@ -25730,6 +25944,7 @@
                 <w:sz w:val="21"/>
                 <w:szCs w:val="21"/>
               </w:rPr>
+              <w:lastRenderedPageBreak/>
               <w:t>Phone</w:t>
             </w:r>
           </w:p>
@@ -25794,7 +26009,6 @@
                 <w:sz w:val="21"/>
                 <w:szCs w:val="21"/>
               </w:rPr>
-              <w:lastRenderedPageBreak/>
               <w:t>Online</w:t>
             </w:r>
           </w:p>
@@ -25840,7 +26054,7 @@
         <w:pStyle w:val="Heading1"/>
         <w:pageBreakBefore/>
       </w:pPr>
-      <w:bookmarkStart w:id="28" w:name="_Toc242880016"/>
+      <w:bookmarkStart w:id="28" w:name="_Toc242884383"/>
       <w:r>
         <w:lastRenderedPageBreak/>
         <w:t>Appendix: Glossary</w:t>
@@ -27046,131 +27260,131 @@
 <file path=word/numbering.xml><?xml version="1.0" encoding="utf-8"?>
 <w:numbering xmlns:wpc="http://schemas.microsoft.com/office/word/2010/wordprocessingCanvas" xmlns:cx="http://schemas.microsoft.com/office/drawing/2014/chartex" xmlns:cx1="http://schemas.microsoft.com/office/drawing/2015/9/8/chartex" xmlns:cx2="http://schemas.microsoft.com/office/drawing/2015/10/21/chartex" xmlns:cx3="http://schemas.microsoft.com/office/drawing/2016/5/9/chartex" xmlns:cx4="http://schemas.microsoft.com/office/drawing/2016/5/10/chartex" xmlns:cx5="http://schemas.microsoft.com/office/drawing/2016/5/11/chartex" xmlns:cx6="http://schemas.microsoft.com/office/drawing/2016/5/12/chartex" xmlns:cx7="http://schemas.microsoft.com/office/drawing/2016/5/13/chartex" xmlns:cx8="http://schemas.microsoft.com/office/drawing/2016/5/14/chartex" xmlns:mc="http://schemas.openxmlformats.org/markup-compatibility/2006" xmlns:aink="http://schemas.microsoft.com/office/drawing/2016/ink" xmlns:am3d="http://schemas.microsoft.com/office/drawing/2017/model3d" xmlns:o="urn:schemas-microsoft-com:office:office" xmlns:oel="http://schemas.microsoft.com/office/2019/extlst" xmlns:r="http://schemas.openxmlformats.org/officeDocument/2006/relationships" xmlns:m="http://schemas.openxmlformats.org/officeDocument/2006/math" xmlns:v="urn:schemas-microsoft-com:vml" xmlns:wp14="http://schemas.microsoft.com/office/word/2010/wordprocessingDrawing" xmlns:wp="http://schemas.openxmlformats.org/drawingml/2006/wordprocessingDrawing" xmlns:w10="urn:schemas-microsoft-com:office:word" xmlns:w="http://schemas.openxmlformats.org/wordprocessingml/2006/main" xmlns:w14="http://schemas.microsoft.com/office/word/2010/wordml" xmlns:w15="http://schemas.microsoft.com/office/word/2012/wordml" xmlns:w16cex="http://schemas.microsoft.com/office/word/2018/wordml/cex" xmlns:w16cid="http://schemas.microsoft.com/office/word/2016/wordml/cid" xmlns:w16="http://schemas.microsoft.com/office/word/2018/wordml" xmlns:w16du="http://schemas.microsoft.com/office/word/2023/wordml/word16du" xmlns:w16sdtdh="http://schemas.microsoft.com/office/word/2020/wordml/sdtdatahash" xmlns:w16sdtfl="http://schemas.microsoft.com/office/word/2024/wordml/sdtformatlock" xmlns:w16se="http://schemas.microsoft.com/office/word/2015/wordml/symex" xmlns:wpg="http://schemas.microsoft.com/office/word/2010/wordprocessingGroup" xmlns:wpi="http://schemas.microsoft.com/office/word/2010/wordprocessingInk" xmlns:wne="http://schemas.microsoft.com/office/word/2006/wordml" xmlns:wps="http://schemas.microsoft.com/office/word/2010/wordprocessingShape" mc:Ignorable="w14 w15 w16se w16cid w16 w16cex w16sdtdh w16sdtfl w16du wp14">
   <w:abstractNum w:abstractNumId="0" w15:restartNumberingAfterBreak="0">
-    <w:nsid w:val="4AAD0231"/>
+    <w:nsid w:val="0F096EF3"/>
     <w:multiLevelType w:val="hybridMultilevel"/>
-    <w:tmpl w:val="85BC0C30"/>
-    <w:lvl w:ilvl="0" w:tplc="12A0CC64">
+    <w:tmpl w:val="3F1A2DAC"/>
+    <w:lvl w:ilvl="0" w:tplc="7DC42510">
       <w:start w:val="1"/>
-      <w:numFmt w:val="decimal"/>
-      <w:lvlText w:val="%1."/>
+      <w:numFmt w:val="bullet"/>
+      <w:lvlText w:val="•"/>
       <w:lvlJc w:val="left"/>
       <w:pPr>
-        <w:ind w:left="540" w:hanging="360"/>
+        <w:ind w:left="540" w:hanging="300"/>
       </w:pPr>
       <w:rPr>
         <w:rFonts w:ascii="Times New Roman" w:eastAsia="Times New Roman" w:hAnsi="Times New Roman" w:cs="Times New Roman"/>
       </w:rPr>
     </w:lvl>
-    <w:lvl w:ilvl="1" w:tplc="BDF03946">
+    <w:lvl w:ilvl="1" w:tplc="38CC56E6" w:tentative="1">
+      <w:start w:val="1"/>
+      <w:numFmt w:val="bullet"/>
+      <w:lvlText w:val="–"/>
+      <w:lvlJc w:val="left"/>
+      <w:pPr>
+        <w:ind w:left="1080" w:hanging="300"/>
+      </w:pPr>
+      <w:rPr>
+        <w:rFonts w:ascii="Times New Roman" w:eastAsia="Times New Roman" w:hAnsi="Times New Roman" w:cs="Times New Roman"/>
+      </w:rPr>
+    </w:lvl>
+    <w:lvl w:ilvl="2" w:tplc="2C3EB1C4">
       <w:numFmt w:val="decimal"/>
       <w:lvlText w:val=""/>
       <w:lvlJc w:val="left"/>
     </w:lvl>
-    <w:lvl w:ilvl="2" w:tplc="8F44BA24">
+    <w:lvl w:ilvl="3" w:tplc="1B026DFE">
       <w:numFmt w:val="decimal"/>
       <w:lvlText w:val=""/>
       <w:lvlJc w:val="left"/>
     </w:lvl>
-    <w:lvl w:ilvl="3" w:tplc="76E4A510">
+    <w:lvl w:ilvl="4" w:tplc="0BE47E7C">
       <w:numFmt w:val="decimal"/>
       <w:lvlText w:val=""/>
       <w:lvlJc w:val="left"/>
     </w:lvl>
-    <w:lvl w:ilvl="4" w:tplc="F098B812">
+    <w:lvl w:ilvl="5" w:tplc="D0C003DC">
       <w:numFmt w:val="decimal"/>
       <w:lvlText w:val=""/>
       <w:lvlJc w:val="left"/>
     </w:lvl>
-    <w:lvl w:ilvl="5" w:tplc="0EB0C380">
+    <w:lvl w:ilvl="6" w:tplc="8EB09AA2">
       <w:numFmt w:val="decimal"/>
       <w:lvlText w:val=""/>
       <w:lvlJc w:val="left"/>
     </w:lvl>
-    <w:lvl w:ilvl="6" w:tplc="A6601A86">
+    <w:lvl w:ilvl="7" w:tplc="AF6676E6">
       <w:numFmt w:val="decimal"/>
       <w:lvlText w:val=""/>
       <w:lvlJc w:val="left"/>
     </w:lvl>
-    <w:lvl w:ilvl="7" w:tplc="0B700590">
-      <w:numFmt w:val="decimal"/>
-      <w:lvlText w:val=""/>
-      <w:lvlJc w:val="left"/>
-    </w:lvl>
-    <w:lvl w:ilvl="8" w:tplc="CAC0C22A">
+    <w:lvl w:ilvl="8" w:tplc="E0E662DC">
       <w:numFmt w:val="decimal"/>
       <w:lvlText w:val=""/>
       <w:lvlJc w:val="left"/>
     </w:lvl>
   </w:abstractNum>
   <w:abstractNum w:abstractNumId="1" w15:restartNumberingAfterBreak="0">
-    <w:nsid w:val="72445A12"/>
+    <w:nsid w:val="238139A7"/>
     <w:multiLevelType w:val="hybridMultilevel"/>
-    <w:tmpl w:val="618A69E8"/>
-    <w:lvl w:ilvl="0" w:tplc="54DAA4B4">
+    <w:tmpl w:val="138A0232"/>
+    <w:lvl w:ilvl="0" w:tplc="B89253F6">
       <w:start w:val="1"/>
-      <w:numFmt w:val="bullet"/>
-      <w:lvlText w:val="•"/>
+      <w:numFmt w:val="decimal"/>
+      <w:lvlText w:val="%1."/>
       <w:lvlJc w:val="left"/>
       <w:pPr>
-        <w:ind w:left="540" w:hanging="300"/>
+        <w:ind w:left="540" w:hanging="360"/>
       </w:pPr>
       <w:rPr>
         <w:rFonts w:ascii="Times New Roman" w:eastAsia="Times New Roman" w:hAnsi="Times New Roman" w:cs="Times New Roman"/>
       </w:rPr>
     </w:lvl>
-    <w:lvl w:ilvl="1" w:tplc="216EE480" w:tentative="1">
-      <w:start w:val="1"/>
-      <w:numFmt w:val="bullet"/>
-      <w:lvlText w:val="–"/>
-      <w:lvlJc w:val="left"/>
-      <w:pPr>
-        <w:ind w:left="1080" w:hanging="300"/>
-      </w:pPr>
-      <w:rPr>
-        <w:rFonts w:ascii="Times New Roman" w:eastAsia="Times New Roman" w:hAnsi="Times New Roman" w:cs="Times New Roman"/>
-      </w:rPr>
-    </w:lvl>
-    <w:lvl w:ilvl="2" w:tplc="AEF8F766">
+    <w:lvl w:ilvl="1" w:tplc="762E39A0">
       <w:numFmt w:val="decimal"/>
       <w:lvlText w:val=""/>
       <w:lvlJc w:val="left"/>
     </w:lvl>
-    <w:lvl w:ilvl="3" w:tplc="9030E516">
+    <w:lvl w:ilvl="2" w:tplc="01D0F73E">
       <w:numFmt w:val="decimal"/>
       <w:lvlText w:val=""/>
       <w:lvlJc w:val="left"/>
     </w:lvl>
-    <w:lvl w:ilvl="4" w:tplc="170A28A8">
+    <w:lvl w:ilvl="3" w:tplc="BBFA0A94">
       <w:numFmt w:val="decimal"/>
       <w:lvlText w:val=""/>
       <w:lvlJc w:val="left"/>
     </w:lvl>
-    <w:lvl w:ilvl="5" w:tplc="14BA8DCC">
+    <w:lvl w:ilvl="4" w:tplc="1C42882A">
       <w:numFmt w:val="decimal"/>
       <w:lvlText w:val=""/>
       <w:lvlJc w:val="left"/>
     </w:lvl>
-    <w:lvl w:ilvl="6" w:tplc="43A808F2">
+    <w:lvl w:ilvl="5" w:tplc="26A027AC">
       <w:numFmt w:val="decimal"/>
       <w:lvlText w:val=""/>
       <w:lvlJc w:val="left"/>
     </w:lvl>
-    <w:lvl w:ilvl="7" w:tplc="91F035E4">
+    <w:lvl w:ilvl="6" w:tplc="51CC5C30">
       <w:numFmt w:val="decimal"/>
       <w:lvlText w:val=""/>
       <w:lvlJc w:val="left"/>
     </w:lvl>
-    <w:lvl w:ilvl="8" w:tplc="C24C541E">
+    <w:lvl w:ilvl="7" w:tplc="24BA66B8">
+      <w:numFmt w:val="decimal"/>
+      <w:lvlText w:val=""/>
+      <w:lvlJc w:val="left"/>
+    </w:lvl>
+    <w:lvl w:ilvl="8" w:tplc="3C4CBE58">
       <w:numFmt w:val="decimal"/>
       <w:lvlText w:val=""/>
       <w:lvlJc w:val="left"/>
     </w:lvl>
   </w:abstractNum>
   <w:abstractNum w:abstractNumId="2" w15:restartNumberingAfterBreak="0">
-    <w:nsid w:val="735E27E0"/>
+    <w:nsid w:val="4C2A3380"/>
     <w:multiLevelType w:val="hybridMultilevel"/>
-    <w:tmpl w:val="25A463EC"/>
-    <w:lvl w:ilvl="0" w:tplc="ABCE7E1C" w:tentative="1">
+    <w:tmpl w:val="C6E2842E"/>
+    <w:lvl w:ilvl="0" w:tplc="75E67472" w:tentative="1">
       <w:start w:val="1"/>
       <w:numFmt w:val="bullet"/>
       <w:lvlText w:val="●"/>
@@ -27179,7 +27393,7 @@
         <w:ind w:left="720" w:hanging="360"/>
       </w:pPr>
     </w:lvl>
-    <w:lvl w:ilvl="1" w:tplc="7A881D20" w:tentative="1">
+    <w:lvl w:ilvl="1" w:tplc="C87A769E" w:tentative="1">
       <w:start w:val="1"/>
       <w:numFmt w:val="bullet"/>
       <w:lvlText w:val="○"/>
@@ -27188,7 +27402,7 @@
         <w:ind w:left="1440" w:hanging="360"/>
       </w:pPr>
     </w:lvl>
-    <w:lvl w:ilvl="2" w:tplc="B1F47022" w:tentative="1">
+    <w:lvl w:ilvl="2" w:tplc="235262A6" w:tentative="1">
       <w:start w:val="1"/>
       <w:numFmt w:val="bullet"/>
       <w:lvlText w:val="■"/>
@@ -27197,7 +27411,7 @@
         <w:ind w:left="2160" w:hanging="360"/>
       </w:pPr>
     </w:lvl>
-    <w:lvl w:ilvl="3" w:tplc="2990F442" w:tentative="1">
+    <w:lvl w:ilvl="3" w:tplc="DBD403CE" w:tentative="1">
       <w:start w:val="1"/>
       <w:numFmt w:val="bullet"/>
       <w:lvlText w:val="●"/>
@@ -27206,7 +27420,7 @@
         <w:ind w:left="2880" w:hanging="360"/>
       </w:pPr>
     </w:lvl>
-    <w:lvl w:ilvl="4" w:tplc="0C7A2768" w:tentative="1">
+    <w:lvl w:ilvl="4" w:tplc="5F3638CA" w:tentative="1">
       <w:start w:val="1"/>
       <w:numFmt w:val="bullet"/>
       <w:lvlText w:val="○"/>
@@ -27215,7 +27429,7 @@
         <w:ind w:left="3600" w:hanging="360"/>
       </w:pPr>
     </w:lvl>
-    <w:lvl w:ilvl="5" w:tplc="0B785298" w:tentative="1">
+    <w:lvl w:ilvl="5" w:tplc="25245972" w:tentative="1">
       <w:start w:val="1"/>
       <w:numFmt w:val="bullet"/>
       <w:lvlText w:val="■"/>
@@ -27224,7 +27438,7 @@
         <w:ind w:left="4320" w:hanging="360"/>
       </w:pPr>
     </w:lvl>
-    <w:lvl w:ilvl="6" w:tplc="FF225264" w:tentative="1">
+    <w:lvl w:ilvl="6" w:tplc="D21E6AA8" w:tentative="1">
       <w:start w:val="1"/>
       <w:numFmt w:val="bullet"/>
       <w:lvlText w:val="●"/>
@@ -27233,7 +27447,7 @@
         <w:ind w:left="5040" w:hanging="360"/>
       </w:pPr>
     </w:lvl>
-    <w:lvl w:ilvl="7" w:tplc="265E2EF4" w:tentative="1">
+    <w:lvl w:ilvl="7" w:tplc="09542B2C" w:tentative="1">
       <w:start w:val="1"/>
       <w:numFmt w:val="bullet"/>
       <w:lvlText w:val="●"/>
@@ -27242,7 +27456,7 @@
         <w:ind w:left="5760" w:hanging="360"/>
       </w:pPr>
     </w:lvl>
-    <w:lvl w:ilvl="8" w:tplc="903E29BC" w:tentative="1">
+    <w:lvl w:ilvl="8" w:tplc="B0564C08" w:tentative="1">
       <w:start w:val="1"/>
       <w:numFmt w:val="bullet"/>
       <w:lvlText w:val="●"/>
@@ -27252,62 +27466,62 @@
       </w:pPr>
     </w:lvl>
   </w:abstractNum>
-  <w:num w:numId="1" w16cid:durableId="1748384355">
+  <w:num w:numId="1" w16cid:durableId="1408575745">
     <w:abstractNumId w:val="2"/>
     <w:lvlOverride w:ilvl="0">
       <w:startOverride w:val="1"/>
     </w:lvlOverride>
   </w:num>
-  <w:num w:numId="2" w16cid:durableId="731006551">
+  <w:num w:numId="2" w16cid:durableId="893543607">
+    <w:abstractNumId w:val="0"/>
+    <w:lvlOverride w:ilvl="0">
+      <w:startOverride w:val="1"/>
+    </w:lvlOverride>
+  </w:num>
+  <w:num w:numId="3" w16cid:durableId="890769642">
     <w:abstractNumId w:val="1"/>
     <w:lvlOverride w:ilvl="0">
       <w:startOverride w:val="1"/>
     </w:lvlOverride>
   </w:num>
-  <w:num w:numId="3" w16cid:durableId="364674118">
-    <w:abstractNumId w:val="0"/>
+  <w:num w:numId="4" w16cid:durableId="229850763">
+    <w:abstractNumId w:val="1"/>
     <w:lvlOverride w:ilvl="0">
       <w:startOverride w:val="1"/>
     </w:lvlOverride>
   </w:num>
-  <w:num w:numId="4" w16cid:durableId="1670331938">
-    <w:abstractNumId w:val="0"/>
+  <w:num w:numId="5" w16cid:durableId="594703835">
+    <w:abstractNumId w:val="1"/>
     <w:lvlOverride w:ilvl="0">
       <w:startOverride w:val="1"/>
     </w:lvlOverride>
   </w:num>
-  <w:num w:numId="5" w16cid:durableId="1642036524">
-    <w:abstractNumId w:val="0"/>
+  <w:num w:numId="6" w16cid:durableId="771362706">
+    <w:abstractNumId w:val="1"/>
     <w:lvlOverride w:ilvl="0">
       <w:startOverride w:val="1"/>
     </w:lvlOverride>
   </w:num>
-  <w:num w:numId="6" w16cid:durableId="430856793">
-    <w:abstractNumId w:val="0"/>
+  <w:num w:numId="7" w16cid:durableId="18969888">
+    <w:abstractNumId w:val="1"/>
     <w:lvlOverride w:ilvl="0">
       <w:startOverride w:val="1"/>
     </w:lvlOverride>
   </w:num>
-  <w:num w:numId="7" w16cid:durableId="1299411757">
-    <w:abstractNumId w:val="0"/>
+  <w:num w:numId="8" w16cid:durableId="588806474">
+    <w:abstractNumId w:val="1"/>
     <w:lvlOverride w:ilvl="0">
       <w:startOverride w:val="1"/>
     </w:lvlOverride>
   </w:num>
-  <w:num w:numId="8" w16cid:durableId="878277464">
-    <w:abstractNumId w:val="0"/>
+  <w:num w:numId="9" w16cid:durableId="1894384609">
+    <w:abstractNumId w:val="1"/>
     <w:lvlOverride w:ilvl="0">
       <w:startOverride w:val="1"/>
     </w:lvlOverride>
   </w:num>
-  <w:num w:numId="9" w16cid:durableId="2010328760">
-    <w:abstractNumId w:val="0"/>
-    <w:lvlOverride w:ilvl="0">
-      <w:startOverride w:val="1"/>
-    </w:lvlOverride>
-  </w:num>
-  <w:num w:numId="10" w16cid:durableId="1770588989">
-    <w:abstractNumId w:val="0"/>
+  <w:num w:numId="10" w16cid:durableId="98457064">
+    <w:abstractNumId w:val="1"/>
     <w:lvlOverride w:ilvl="0">
       <w:startOverride w:val="1"/>
     </w:lvlOverride>
@@ -27963,7 +28177,7 @@
     <w:autoRedefine/>
     <w:uiPriority w:val="39"/>
     <w:unhideWhenUsed/>
-    <w:rsid w:val="004C1B46"/>
+    <w:rsid w:val="00394E77"/>
     <w:pPr>
       <w:spacing w:after="100"/>
     </w:pPr>

</xml_diff>